<commit_message>
feat(ai): add deepseek-v4-flash model config + pricing, AI refinements
</commit_message>
<xml_diff>
--- a/docs/word files/questions mcq.docx
+++ b/docs/word files/questions mcq.docx
@@ -93,36 +93,6 @@
           <w:szCs w:val="26"/>
         </w:rPr>
         <w:t>@@MCQ@@</w:t>
-      </w:r>
-    </w:p>
-    <w:p>
-      <w:pPr>
-        <w:pStyle w:val="Heading2"/>
-        <w:bidi w:val="0"/>
-        <w:rPr>
-          <w:rFonts w:asciiTheme="minorHAnsi" w:eastAsia="MS Mincho" w:hAnsiTheme="minorHAnsi" w:cstheme="minorHAnsi"/>
-          <w:sz w:val="28"/>
-          <w:szCs w:val="24"/>
-          <w:highlight w:val="yellow"/>
-        </w:rPr>
-      </w:pPr>
-      <w:r>
-        <w:rPr>
-          <w:rFonts w:asciiTheme="minorHAnsi" w:eastAsia="MS Mincho" w:hAnsiTheme="minorHAnsi" w:cstheme="minorHAnsi"/>
-          <w:sz w:val="28"/>
-          <w:szCs w:val="24"/>
-          <w:highlight w:val="yellow"/>
-        </w:rPr>
-        <w:t>(</w:t>
-      </w:r>
-      <w:r>
-        <w:rPr>
-          <w:rFonts w:asciiTheme="minorHAnsi" w:eastAsia="MS Mincho" w:hAnsiTheme="minorHAnsi" w:cstheme="minorHAnsi"/>
-          <w:sz w:val="28"/>
-          <w:szCs w:val="24"/>
-          <w:highlight w:val="yellow"/>
-        </w:rPr>
-        <w:t>1) Choose the correct answer from a, b, c, or d:</w:t>
       </w:r>
     </w:p>
     <w:p>
@@ -2922,6 +2892,460 @@
     </w:tbl>
     <w:p>
       <w:pPr>
+        <w:numPr>
+          <w:ilvl w:val="0"/>
+          <w:numId w:val="27"/>
+        </w:numPr>
+        <w:spacing w:after="0" w:line="240" w:lineRule="auto"/>
+        <w:ind w:left="360"/>
+        <w:rPr>
+          <w:rFonts w:ascii="Calibri" w:eastAsia="Times New Roman" w:hAnsi="Calibri" w:cs="Calibri"/>
+          <w:sz w:val="28"/>
+          <w:szCs w:val="28"/>
+        </w:rPr>
+      </w:pPr>
+      <w:r>
+        <w:rPr>
+          <w:rFonts w:ascii="Calibri" w:eastAsia="Times New Roman" w:hAnsi="Calibri" w:cs="Calibri"/>
+          <w:sz w:val="28"/>
+          <w:szCs w:val="28"/>
+        </w:rPr>
+        <w:t>SB Which sentence tells us that Tom is still working in the factory? (</w:t>
+      </w:r>
+      <w:r>
+        <w:rPr>
+          <w:rFonts w:ascii="29LT Bukra Bold Italic" w:eastAsia="Times New Roman" w:hAnsi="29LT Bukra Bold Italic" w:cs="29LT Bukra Bold Italic"/>
+          <w:b/>
+          <w:bCs/>
+          <w:sz w:val="24"/>
+          <w:szCs w:val="24"/>
+        </w:rPr>
+        <w:t>2025</w:t>
+      </w:r>
+      <w:r>
+        <w:rPr>
+          <w:rFonts w:ascii="Calibri" w:eastAsia="Times New Roman" w:hAnsi="Calibri" w:cs="Calibri"/>
+          <w:sz w:val="28"/>
+          <w:szCs w:val="28"/>
+        </w:rPr>
+        <w:t>)</w:t>
+      </w:r>
+    </w:p>
+    <w:tbl>
+      <w:tblPr>
+        <w:tblW w:w="0" w:type="auto"/>
+        <w:tblLayout w:type="fixed"/>
+        <w:tblLook w:val="04A0" w:firstRow="1" w:lastRow="0" w:firstColumn="1" w:lastColumn="0" w:noHBand="0" w:noVBand="1"/>
+      </w:tblPr>
+      <w:tblGrid>
+        <w:gridCol w:w="2619"/>
+        <w:gridCol w:w="2619"/>
+        <w:gridCol w:w="2619"/>
+        <w:gridCol w:w="2619"/>
+      </w:tblGrid>
+      <w:tr>
+        <w:tc>
+          <w:tcPr>
+            <w:tcW w:w="2619" w:type="dxa"/>
+            <w:hideMark/>
+          </w:tcPr>
+          <w:p>
+            <w:pPr>
+              <w:spacing w:after="0" w:line="240" w:lineRule="auto"/>
+              <w:ind w:left="360" w:right="-118"/>
+              <w:rPr>
+                <w:rFonts w:ascii="Calibri" w:eastAsia="Times New Roman" w:hAnsi="Calibri" w:cs="Calibri"/>
+                <w:b/>
+                <w:bCs/>
+                <w:color w:val="990033"/>
+                <w:sz w:val="26"/>
+                <w:szCs w:val="26"/>
+              </w:rPr>
+            </w:pPr>
+            <w:r>
+              <w:rPr>
+                <w:rFonts w:eastAsia="Calibri" w:cstheme="minorHAnsi"/>
+                <w:b/>
+                <w:color w:val="000000" w:themeColor="text1"/>
+                <w:sz w:val="28"/>
+                <w:szCs w:val="28"/>
+              </w:rPr>
+              <w:t>a.</w:t>
+            </w:r>
+            <w:r>
+              <w:rPr>
+                <w:rFonts w:eastAsia="Calibri" w:cstheme="minorHAnsi"/>
+                <w:b/>
+                <w:color w:val="800000"/>
+                <w:sz w:val="28"/>
+                <w:szCs w:val="28"/>
+              </w:rPr>
+              <w:t xml:space="preserve"> Tom worked in that factory for ten years.</w:t>
+            </w:r>
+          </w:p>
+        </w:tc>
+        <w:tc>
+          <w:tcPr>
+            <w:tcW w:w="2619" w:type="dxa"/>
+            <w:hideMark/>
+          </w:tcPr>
+          <w:p>
+            <w:pPr>
+              <w:spacing w:after="0" w:line="240" w:lineRule="auto"/>
+              <w:ind w:left="360" w:right="-118"/>
+              <w:rPr>
+                <w:rFonts w:ascii="Calibri" w:eastAsia="Times New Roman" w:hAnsi="Calibri" w:cs="Calibri"/>
+                <w:b/>
+                <w:bCs/>
+                <w:color w:val="990033"/>
+                <w:sz w:val="26"/>
+                <w:szCs w:val="26"/>
+              </w:rPr>
+            </w:pPr>
+            <w:r>
+              <w:rPr>
+                <w:rFonts w:eastAsia="Calibri" w:cstheme="minorHAnsi"/>
+                <w:b/>
+                <w:color w:val="000000" w:themeColor="text1"/>
+                <w:sz w:val="28"/>
+                <w:szCs w:val="28"/>
+              </w:rPr>
+              <w:t>b.</w:t>
+            </w:r>
+            <w:r>
+              <w:rPr>
+                <w:rFonts w:eastAsia="Calibri" w:cstheme="minorHAnsi"/>
+                <w:b/>
+                <w:color w:val="800000"/>
+                <w:sz w:val="28"/>
+                <w:szCs w:val="28"/>
+              </w:rPr>
+              <w:t xml:space="preserve"> Tom used to work in that factory.</w:t>
+            </w:r>
+          </w:p>
+        </w:tc>
+        <w:tc>
+          <w:tcPr>
+            <w:tcW w:w="2619" w:type="dxa"/>
+            <w:hideMark/>
+          </w:tcPr>
+          <w:p>
+            <w:pPr>
+              <w:spacing w:after="0" w:line="240" w:lineRule="auto"/>
+              <w:ind w:left="360" w:right="-118"/>
+              <w:rPr>
+                <w:rFonts w:ascii="Calibri" w:eastAsia="Times New Roman" w:hAnsi="Calibri" w:cs="Calibri"/>
+                <w:b/>
+                <w:bCs/>
+                <w:color w:val="990033"/>
+                <w:sz w:val="26"/>
+                <w:szCs w:val="26"/>
+              </w:rPr>
+            </w:pPr>
+            <w:r>
+              <w:rPr>
+                <w:rFonts w:eastAsia="Calibri" w:cstheme="minorHAnsi"/>
+                <w:b/>
+                <w:sz w:val="28"/>
+                <w:szCs w:val="28"/>
+              </w:rPr>
+              <w:t>c.</w:t>
+            </w:r>
+            <w:r>
+              <w:rPr>
+                <w:rFonts w:eastAsia="Calibri" w:cstheme="minorHAnsi"/>
+                <w:b/>
+                <w:color w:val="800000"/>
+                <w:sz w:val="28"/>
+                <w:szCs w:val="28"/>
+              </w:rPr>
+              <w:t xml:space="preserve"> Tom has worked in that factory for ten years.</w:t>
+            </w:r>
+          </w:p>
+        </w:tc>
+        <w:tc>
+          <w:tcPr>
+            <w:tcW w:w="2619" w:type="dxa"/>
+            <w:hideMark/>
+          </w:tcPr>
+          <w:p>
+            <w:pPr>
+              <w:spacing w:after="0" w:line="240" w:lineRule="auto"/>
+              <w:ind w:left="360" w:right="-118"/>
+              <w:rPr>
+                <w:rFonts w:ascii="Calibri" w:eastAsia="Times New Roman" w:hAnsi="Calibri" w:cs="Calibri"/>
+                <w:b/>
+                <w:bCs/>
+                <w:color w:val="990033"/>
+                <w:sz w:val="26"/>
+                <w:szCs w:val="26"/>
+              </w:rPr>
+            </w:pPr>
+            <w:r>
+              <w:rPr>
+                <w:rFonts w:eastAsia="Calibri" w:cstheme="minorHAnsi"/>
+                <w:b/>
+                <w:sz w:val="28"/>
+                <w:szCs w:val="28"/>
+              </w:rPr>
+              <w:t>d.</w:t>
+            </w:r>
+            <w:r>
+              <w:rPr>
+                <w:rFonts w:eastAsia="Calibri" w:cstheme="minorHAnsi"/>
+                <w:b/>
+                <w:color w:val="800000"/>
+                <w:sz w:val="28"/>
+                <w:szCs w:val="28"/>
+              </w:rPr>
+              <w:t xml:space="preserve"> Tom was working in that factory.</w:t>
+            </w:r>
+          </w:p>
+        </w:tc>
+      </w:tr>
+    </w:tbl>
+    <w:p>
+      <w:pPr>
+        <w:numPr>
+          <w:ilvl w:val="0"/>
+          <w:numId w:val="27"/>
+        </w:numPr>
+        <w:spacing w:after="0" w:line="240" w:lineRule="auto"/>
+        <w:ind w:left="360"/>
+        <w:rPr>
+          <w:rFonts w:ascii="Calibri" w:eastAsia="Times New Roman" w:hAnsi="Calibri" w:cs="Calibri"/>
+          <w:sz w:val="28"/>
+          <w:szCs w:val="28"/>
+        </w:rPr>
+      </w:pPr>
+      <w:r>
+        <w:rPr>
+          <w:rFonts w:ascii="Calibri" w:eastAsia="Times New Roman" w:hAnsi="Calibri" w:cs="Calibri"/>
+          <w:sz w:val="28"/>
+          <w:szCs w:val="28"/>
+        </w:rPr>
+        <w:t>Many of today’s great writers .......... as teachers.</w:t>
+      </w:r>
+    </w:p>
+    <w:tbl>
+      <w:tblPr>
+        <w:tblW w:w="0" w:type="auto"/>
+        <w:tblLayout w:type="fixed"/>
+        <w:tblLook w:val="04A0" w:firstRow="1" w:lastRow="0" w:firstColumn="1" w:lastColumn="0" w:noHBand="0" w:noVBand="1"/>
+      </w:tblPr>
+      <w:tblGrid>
+        <w:gridCol w:w="2619"/>
+        <w:gridCol w:w="2619"/>
+        <w:gridCol w:w="2619"/>
+        <w:gridCol w:w="2619"/>
+      </w:tblGrid>
+      <w:tr>
+        <w:tc>
+          <w:tcPr>
+            <w:tcW w:w="2619" w:type="dxa"/>
+            <w:hideMark/>
+          </w:tcPr>
+          <w:p>
+            <w:pPr>
+              <w:spacing w:after="0" w:line="240" w:lineRule="auto"/>
+              <w:ind w:left="360" w:right="-118"/>
+              <w:rPr>
+                <w:rFonts w:ascii="Calibri" w:eastAsia="Times New Roman" w:hAnsi="Calibri" w:cs="Calibri"/>
+                <w:b/>
+                <w:bCs/>
+                <w:color w:val="990033"/>
+                <w:sz w:val="26"/>
+                <w:szCs w:val="26"/>
+              </w:rPr>
+            </w:pPr>
+            <w:r>
+              <w:rPr>
+                <w:rFonts w:eastAsia="Calibri" w:cstheme="minorHAnsi"/>
+                <w:b/>
+                <w:color w:val="000000" w:themeColor="text1"/>
+                <w:sz w:val="28"/>
+                <w:szCs w:val="28"/>
+              </w:rPr>
+              <w:t>a.</w:t>
+            </w:r>
+            <w:r>
+              <w:rPr>
+                <w:rFonts w:eastAsia="Calibri" w:cstheme="minorHAnsi"/>
+                <w:b/>
+                <w:color w:val="800000"/>
+                <w:sz w:val="28"/>
+                <w:szCs w:val="28"/>
+              </w:rPr>
+              <w:t xml:space="preserve"> </w:t>
+            </w:r>
+            <w:proofErr w:type="gramStart"/>
+            <w:r>
+              <w:rPr>
+                <w:rFonts w:eastAsia="Calibri" w:cstheme="minorHAnsi"/>
+                <w:b/>
+                <w:color w:val="800000"/>
+                <w:sz w:val="28"/>
+                <w:szCs w:val="28"/>
+              </w:rPr>
+              <w:t>have</w:t>
+            </w:r>
+            <w:proofErr w:type="gramEnd"/>
+            <w:r>
+              <w:rPr>
+                <w:rFonts w:eastAsia="Calibri" w:cstheme="minorHAnsi"/>
+                <w:b/>
+                <w:color w:val="800000"/>
+                <w:sz w:val="28"/>
+                <w:szCs w:val="28"/>
+              </w:rPr>
+              <w:t xml:space="preserve"> also worked</w:t>
+            </w:r>
+          </w:p>
+        </w:tc>
+        <w:tc>
+          <w:tcPr>
+            <w:tcW w:w="2619" w:type="dxa"/>
+            <w:hideMark/>
+          </w:tcPr>
+          <w:p>
+            <w:pPr>
+              <w:spacing w:after="0" w:line="240" w:lineRule="auto"/>
+              <w:ind w:left="360" w:right="-118"/>
+              <w:rPr>
+                <w:rFonts w:ascii="Calibri" w:eastAsia="Times New Roman" w:hAnsi="Calibri" w:cs="Calibri"/>
+                <w:b/>
+                <w:bCs/>
+                <w:color w:val="990033"/>
+                <w:sz w:val="26"/>
+                <w:szCs w:val="26"/>
+              </w:rPr>
+            </w:pPr>
+            <w:r>
+              <w:rPr>
+                <w:rFonts w:eastAsia="Calibri" w:cstheme="minorHAnsi"/>
+                <w:b/>
+                <w:color w:val="000000" w:themeColor="text1"/>
+                <w:sz w:val="28"/>
+                <w:szCs w:val="28"/>
+              </w:rPr>
+              <w:t>b.</w:t>
+            </w:r>
+            <w:r>
+              <w:rPr>
+                <w:rFonts w:eastAsia="Calibri" w:cstheme="minorHAnsi"/>
+                <w:b/>
+                <w:color w:val="800000"/>
+                <w:sz w:val="28"/>
+                <w:szCs w:val="28"/>
+              </w:rPr>
+              <w:t xml:space="preserve"> had also worked</w:t>
+            </w:r>
+          </w:p>
+        </w:tc>
+        <w:tc>
+          <w:tcPr>
+            <w:tcW w:w="2619" w:type="dxa"/>
+            <w:hideMark/>
+          </w:tcPr>
+          <w:p>
+            <w:pPr>
+              <w:spacing w:after="0" w:line="240" w:lineRule="auto"/>
+              <w:ind w:left="360" w:right="-118"/>
+              <w:rPr>
+                <w:rFonts w:ascii="Calibri" w:eastAsia="Times New Roman" w:hAnsi="Calibri" w:cs="Calibri"/>
+                <w:b/>
+                <w:bCs/>
+                <w:color w:val="990033"/>
+                <w:sz w:val="26"/>
+                <w:szCs w:val="26"/>
+              </w:rPr>
+            </w:pPr>
+            <w:r>
+              <w:rPr>
+                <w:rFonts w:eastAsia="Calibri" w:cstheme="minorHAnsi"/>
+                <w:b/>
+                <w:sz w:val="28"/>
+                <w:szCs w:val="28"/>
+              </w:rPr>
+              <w:t>c.</w:t>
+            </w:r>
+            <w:r>
+              <w:rPr>
+                <w:rFonts w:eastAsia="Calibri" w:cstheme="minorHAnsi"/>
+                <w:b/>
+                <w:color w:val="800000"/>
+                <w:sz w:val="28"/>
+                <w:szCs w:val="28"/>
+              </w:rPr>
+              <w:t xml:space="preserve"> also works</w:t>
+            </w:r>
+          </w:p>
+        </w:tc>
+        <w:tc>
+          <w:tcPr>
+            <w:tcW w:w="2619" w:type="dxa"/>
+            <w:hideMark/>
+          </w:tcPr>
+          <w:p>
+            <w:pPr>
+              <w:spacing w:after="0" w:line="240" w:lineRule="auto"/>
+              <w:ind w:left="360" w:right="-118"/>
+              <w:rPr>
+                <w:rFonts w:ascii="Calibri" w:eastAsia="Times New Roman" w:hAnsi="Calibri" w:cs="Calibri"/>
+                <w:b/>
+                <w:bCs/>
+                <w:color w:val="990033"/>
+                <w:sz w:val="26"/>
+                <w:szCs w:val="26"/>
+              </w:rPr>
+            </w:pPr>
+            <w:r>
+              <w:rPr>
+                <w:rFonts w:eastAsia="Calibri" w:cstheme="minorHAnsi"/>
+                <w:b/>
+                <w:sz w:val="28"/>
+                <w:szCs w:val="28"/>
+              </w:rPr>
+              <w:t>d.</w:t>
+            </w:r>
+            <w:r>
+              <w:rPr>
+                <w:rFonts w:eastAsia="Calibri" w:cstheme="minorHAnsi"/>
+                <w:b/>
+                <w:color w:val="800000"/>
+                <w:sz w:val="28"/>
+                <w:szCs w:val="28"/>
+              </w:rPr>
+              <w:t xml:space="preserve"> </w:t>
+            </w:r>
+            <w:proofErr w:type="gramStart"/>
+            <w:r>
+              <w:rPr>
+                <w:rFonts w:eastAsia="Calibri" w:cstheme="minorHAnsi"/>
+                <w:b/>
+                <w:color w:val="800000"/>
+                <w:sz w:val="28"/>
+                <w:szCs w:val="28"/>
+              </w:rPr>
+              <w:t>are</w:t>
+            </w:r>
+            <w:proofErr w:type="gramEnd"/>
+            <w:r>
+              <w:rPr>
+                <w:rFonts w:eastAsia="Calibri" w:cstheme="minorHAnsi"/>
+                <w:b/>
+                <w:color w:val="800000"/>
+                <w:sz w:val="28"/>
+                <w:szCs w:val="28"/>
+              </w:rPr>
+              <w:t xml:space="preserve"> also working</w:t>
+            </w:r>
+          </w:p>
+        </w:tc>
+      </w:tr>
+    </w:tbl>
+    <w:p>
+      <w:pPr>
         <w:tabs>
           <w:tab w:val="left" w:pos="8505"/>
         </w:tabs>
@@ -3141,6 +3565,7 @@
           <w:sz w:val="26"/>
           <w:szCs w:val="26"/>
         </w:rPr>
+        <w:lastRenderedPageBreak/>
         <w:t>8=a</w:t>
       </w:r>
     </w:p>
@@ -3253,6 +3678,98 @@
         </w:rPr>
         <w:t>13=c</w:t>
       </w:r>
+    </w:p>
+    <w:p>
+      <w:pPr>
+        <w:tabs>
+          <w:tab w:val="left" w:pos="8505"/>
+        </w:tabs>
+        <w:spacing w:after="0" w:line="240" w:lineRule="auto"/>
+        <w:jc w:val="both"/>
+        <w:rPr>
+          <w:rFonts w:ascii="Calibri" w:eastAsia="MS Mincho" w:hAnsi="Calibri" w:cs="Arial"/>
+          <w:sz w:val="26"/>
+          <w:szCs w:val="26"/>
+        </w:rPr>
+      </w:pPr>
+      <w:r>
+        <w:rPr>
+          <w:rFonts w:ascii="Calibri" w:eastAsia="MS Mincho" w:hAnsi="Calibri" w:cs="Arial"/>
+          <w:sz w:val="26"/>
+          <w:szCs w:val="26"/>
+        </w:rPr>
+        <w:t>1</w:t>
+      </w:r>
+      <w:r>
+        <w:rPr>
+          <w:rFonts w:ascii="Calibri" w:eastAsia="MS Mincho" w:hAnsi="Calibri" w:cs="Arial" w:hint="cs"/>
+          <w:sz w:val="26"/>
+          <w:szCs w:val="26"/>
+          <w:rtl/>
+        </w:rPr>
+        <w:t>4</w:t>
+      </w:r>
+      <w:r>
+        <w:rPr>
+          <w:rFonts w:ascii="Calibri" w:eastAsia="MS Mincho" w:hAnsi="Calibri" w:cs="Arial"/>
+          <w:sz w:val="26"/>
+          <w:szCs w:val="26"/>
+        </w:rPr>
+        <w:t>=a</w:t>
+      </w:r>
+    </w:p>
+    <w:p>
+      <w:pPr>
+        <w:tabs>
+          <w:tab w:val="left" w:pos="8505"/>
+        </w:tabs>
+        <w:spacing w:after="0" w:line="240" w:lineRule="auto"/>
+        <w:jc w:val="both"/>
+        <w:rPr>
+          <w:rFonts w:ascii="Calibri" w:eastAsia="MS Mincho" w:hAnsi="Calibri" w:cs="Arial"/>
+          <w:sz w:val="26"/>
+          <w:szCs w:val="26"/>
+        </w:rPr>
+      </w:pPr>
+      <w:r>
+        <w:rPr>
+          <w:rFonts w:ascii="Calibri" w:eastAsia="MS Mincho" w:hAnsi="Calibri" w:cs="Arial"/>
+          <w:sz w:val="26"/>
+          <w:szCs w:val="26"/>
+        </w:rPr>
+        <w:t>1</w:t>
+      </w:r>
+      <w:r>
+        <w:rPr>
+          <w:rFonts w:ascii="Calibri" w:eastAsia="MS Mincho" w:hAnsi="Calibri" w:cs="Arial" w:hint="cs"/>
+          <w:sz w:val="26"/>
+          <w:szCs w:val="26"/>
+          <w:rtl/>
+        </w:rPr>
+        <w:t>5</w:t>
+      </w:r>
+      <w:r>
+        <w:rPr>
+          <w:rFonts w:ascii="Calibri" w:eastAsia="MS Mincho" w:hAnsi="Calibri" w:cs="Arial"/>
+          <w:sz w:val="26"/>
+          <w:szCs w:val="26"/>
+        </w:rPr>
+        <w:t>=c</w:t>
+      </w:r>
+    </w:p>
+    <w:p>
+      <w:pPr>
+        <w:tabs>
+          <w:tab w:val="left" w:pos="8505"/>
+        </w:tabs>
+        <w:spacing w:after="0" w:line="240" w:lineRule="auto"/>
+        <w:jc w:val="both"/>
+        <w:rPr>
+          <w:rFonts w:ascii="Calibri" w:eastAsia="MS Mincho" w:hAnsi="Calibri" w:cs="Arial"/>
+          <w:sz w:val="26"/>
+          <w:szCs w:val="26"/>
+        </w:rPr>
+      </w:pPr>
     </w:p>
     <w:bookmarkEnd w:id="0"/>
     <w:sectPr>
@@ -3836,7 +4353,7 @@
         </mc:Choice>
         <mc:Fallback>
           <w:pict>
-            <v:group w14:anchorId="1390093B" id="Group 214" o:spid="_x0000_s1026" style="position:absolute;margin-left:-25pt;margin-top:.2pt;width:564.1pt;height:38.15pt;z-index:251661312;mso-width-relative:margin;mso-height-relative:margin" coordorigin="405" coordsize="71640,4846" o:gfxdata="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">
+            <v:group w14:anchorId="379E15C3" id="Group 214" o:spid="_x0000_s1026" style="position:absolute;margin-left:-25pt;margin-top:.2pt;width:564.1pt;height:38.15pt;z-index:251661312;mso-width-relative:margin;mso-height-relative:margin" coordorigin="405" coordsize="71640,4846" o:gfxdata="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">
               <v:group id="Group 204" o:spid="_x0000_s1027" style="position:absolute;left:405;width:71640;height:4846" coordorigin="405" coordsize="71640,4846" o:gfxdata="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">
                 <v:group id="Group 177" o:spid="_x0000_s1028" style="position:absolute;left:405;width:71640;height:4077" coordorigin="-41" coordsize="71358,5462" o:gfxdata="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">
                   <v:shapetype id="_x0000_t75" coordsize="21600,21600" o:spt="75" o:preferrelative="t" path="m@4@5l@4@11@9@11@9@5xe" filled="f" stroked="f">
@@ -4407,7 +4924,7 @@
         </mc:Choice>
         <mc:Fallback>
           <w:pict>
-            <v:group w14:anchorId="32EA47BE" id="Group 14" o:spid="_x0000_s1026" style="position:absolute;margin-left:-23.65pt;margin-top:-5.8pt;width:561.6pt;height:39.5pt;z-index:251653120" coordsize="71323,5018" o:gfxdata="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">
+            <v:group w14:anchorId="50C27DC5" id="Group 14" o:spid="_x0000_s1026" style="position:absolute;margin-left:-23.65pt;margin-top:-5.8pt;width:561.6pt;height:39.5pt;z-index:251653120" coordsize="71323,5018" o:gfxdata="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">
               <v:group id="Group 67" o:spid="_x0000_s1027" style="position:absolute;width:71323;height:5018" coordsize="71323,5018" o:gfxdata="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">
                 <v:group id="Group 92344" o:spid="_x0000_s1028" style="position:absolute;width:71323;height:5018" coordsize="71323,5018" o:gfxdata="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">
                   <v:group id="Group 92347" o:spid="_x0000_s1029" style="position:absolute;top:668;width:71323;height:4350" coordorigin=",264" coordsize="71116,5539" o:gfxdata="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">
@@ -7574,6 +8091,9 @@
   </w:num>
   <w:num w:numId="28" w16cid:durableId="1070882024">
     <w:abstractNumId w:val="26"/>
+  </w:num>
+  <w:num w:numId="29" w16cid:durableId="292836081">
+    <w:abstractNumId w:val="3"/>
   </w:num>
   <w:numIdMacAtCleanup w:val="8"/>
 </w:numbering>
@@ -7977,7 +8497,7 @@
   <w:style w:type="paragraph" w:default="1" w:styleId="Normal">
     <w:name w:val="Normal"/>
     <w:qFormat/>
-    <w:rsid w:val="006408FC"/>
+    <w:rsid w:val="00633C98"/>
     <w:rPr>
       <w:rFonts w:eastAsiaTheme="minorEastAsia"/>
     </w:rPr>

</xml_diff>